<commit_message>
docs(contract): fill dates and periods, narrow support scope per review
Contract date 19/10/2026; installation 1 business day; delivery notice within 1
day; acceptance period 5 business days with acceptance test on 26 Oct 2026;
support period 3 months; first response 2 business days. 7.2 now covers only
errors reported within the support period.

Co-Authored-By: Claude Sonnet 5.5 <noreply@anthropic.com>
</commit_message>
<xml_diff>
--- a/docs/TestZede-Sozlesme.docx
+++ b/docs/TestZede-Sozlesme.docx
@@ -69,7 +69,7 @@
         <w:t xml:space="preserve">Sözleşme Tarihi:</w:t>
       </w:r>
       <w:r>
-        <w:t xml:space="preserve"> ……/……/…….   </w:t>
+        <w:t xml:space="preserve"> 19/10/2026   </w:t>
       </w:r>
       <w:r>
         <w:rPr>
@@ -854,7 +854,7 @@
         <w:t xml:space="preserve">3.4. TestZede’nin Kurulumu:</w:t>
       </w:r>
       <w:r>
-        <w:t xml:space="preserve"> Gerekli yapılanmanın sağlanmasından sonra TestZede, depodaki README dosyasında belirtilen adımlarla (sanal ortam oluşturma, bağımlılıkların kurulması) kurulur. Kurulum süresi …… iş günüdür.</w:t>
+        <w:t xml:space="preserve"> Gerekli yapılanmanın sağlanmasından sonra TestZede, depodaki README dosyasında belirtilen adımlarla (sanal ortam oluşturma, bağımlılıkların kurulması) kurulur. Kurulum süresi 1 (bir) iş günüdür.</w:t>
       </w:r>
     </w:p>
     <w:p>
@@ -1213,7 +1213,7 @@
         <w:t xml:space="preserve">6.1. Ürün Teslimi:</w:t>
       </w:r>
       <w:r>
-        <w:t xml:space="preserve"> EKİP, TestZede’nin tüm kullanıcı hikâyelerini içeren sürümünün tamamlandığını MÜŞTERİ’ye sözleşme tarihine müteakip …… gün içinde yazılı olarak bildirecektir.</w:t>
+        <w:t xml:space="preserve"> EKİP, TestZede’nin tüm kullanıcı hikâyelerini içeren sürümünün tamamlandığını MÜŞTERİ’ye sözleşme tarihine müteakip 1 (bir) gün içinde yazılı olarak bildirecektir.</w:t>
       </w:r>
     </w:p>
     <w:p>
@@ -1277,7 +1277,7 @@
         <w:t xml:space="preserve">6.3. Kabul Süresi:</w:t>
       </w:r>
       <w:r>
-        <w:t xml:space="preserve"> MÜŞTERİ, ürün teslimini yazılı bildirdikten sonraki …… iş günü içinde testleri tamamlar.</w:t>
+        <w:t xml:space="preserve"> MÜŞTERİ, ürün teslimini yazılı bildirdikten sonraki 5 (beş) iş günü içinde testleri tamamlar. Kabul testi 26 Ekim 2026 tarihinde yapılır.</w:t>
       </w:r>
     </w:p>
     <w:p>
@@ -1301,7 +1301,7 @@
         <w:t xml:space="preserve">7.1. Destek Süresi:</w:t>
       </w:r>
       <w:r>
-        <w:t xml:space="preserve"> EKİP, TestZede’yi MÜŞTERİ’nin kabul onayından sonraki …… süre ile ücretsiz destekleyecektir.</w:t>
+        <w:t xml:space="preserve"> EKİP, TestZede’yi MÜŞTERİ’nin kabul onayından sonraki 3 (üç) ay süre ile ücretsiz destekleyecektir.</w:t>
       </w:r>
     </w:p>
     <w:p>
@@ -1317,7 +1317,7 @@
         <w:t xml:space="preserve">7.2. Destek Kapsamı:</w:t>
       </w:r>
       <w:r>
-        <w:t xml:space="preserve"> TestZede’nin içerebileceği tüm yazılım hatalarının ve hatalı işleyişlerin en kısa süre zarfında düzeltilmesini kapsar.</w:t>
+        <w:t xml:space="preserve"> Destek süresi içinde bildirilen yazılım hatalarının ve hatalı işleyişlerin en kısa süre zarfında düzeltilmesini kapsar.</w:t>
       </w:r>
     </w:p>
     <w:p>
@@ -1333,7 +1333,7 @@
         <w:t xml:space="preserve">7.3. Destek Şekli ve Zamanlama:</w:t>
       </w:r>
       <w:r>
-        <w:t xml:space="preserve"> MÜŞTERİ hataları depo üzerinden (GitHub Issues) ya da e-posta ile bildirir. EKİP, bildirimi takip eden …… iş günü içinde ilk müdahaleyi gerçekleştirecektir.</w:t>
+        <w:t xml:space="preserve"> MÜŞTERİ hataları depo üzerinden (GitHub Issues) ya da e-posta ile bildirir. EKİP, bildirimi takip eden 2 (iki) iş günü içinde ilk müdahaleyi gerçekleştirecektir.</w:t>
       </w:r>
     </w:p>
     <w:p>

</xml_diff>